<commit_message>
feat: implement infinite scroll for audit logs and update QA agent documentation for micro-iteration workflow
</commit_message>
<xml_diff>
--- a/docs/company-files/Quy trình vận hành và quản lý vận chuyển tại Công ty TNHH NePO.docx
+++ b/docs/company-files/Quy trình vận hành và quản lý vận chuyển tại Công ty TNHH NePO.docx
@@ -895,6 +895,811 @@
         <w:t>Hiển thị các thông tin trực quan tổng hợp về tình hình khai thác phương tiện</w:t>
       </w:r>
     </w:p>
+    <w:p/>
+    <w:p/>
+    <w:p>
+      <w:pPr>
+        <w:spacing w:before="100" w:beforeAutospacing="1" w:after="100" w:afterAutospacing="1" w:line="240" w:lineRule="auto"/>
+        <w:rPr>
+          <w:rFonts w:ascii="Times New Roman" w:eastAsia="Times New Roman" w:hAnsi="Times New Roman" w:cs="Times New Roman"/>
+          <w:kern w:val="0"/>
+          <w14:ligatures w14:val="none"/>
+        </w:rPr>
+      </w:pPr>
+      <w:r>
+        <w:rPr>
+          <w:rFonts w:ascii="Times New Roman" w:eastAsia="Times New Roman" w:hAnsi="Times New Roman" w:cs="Times New Roman"/>
+          <w:kern w:val="0"/>
+          <w14:ligatures w14:val="none"/>
+        </w:rPr>
+        <w:t xml:space="preserve">Dựa trên bối cảnh NePO Corp là một công ty giao nhận và logistics quốc tế tại Việt Nam (chuyên vận tải nội địa, cước đường biển và đại lý hải quan), sơ đồ viết tay trong tệp "image_ee824a.jpg" phác thảo </w:t>
+      </w:r>
+      <w:r>
+        <w:rPr>
+          <w:rFonts w:ascii="Times New Roman" w:eastAsia="Times New Roman" w:hAnsi="Times New Roman" w:cs="Times New Roman"/>
+          <w:b/>
+          <w:bCs/>
+          <w:kern w:val="0"/>
+          <w14:ligatures w14:val="none"/>
+        </w:rPr>
+        <w:t>quy trình vận hành và tài chính cho đội xe tải nội địa</w:t>
+      </w:r>
+      <w:r>
+        <w:rPr>
+          <w:rFonts w:ascii="Times New Roman" w:eastAsia="Times New Roman" w:hAnsi="Times New Roman" w:cs="Times New Roman"/>
+          <w:kern w:val="0"/>
+          <w14:ligatures w14:val="none"/>
+        </w:rPr>
+        <w:t xml:space="preserve"> của họ.</w:t>
+      </w:r>
+    </w:p>
+    <w:p>
+      <w:pPr>
+        <w:spacing w:before="100" w:beforeAutospacing="1" w:after="100" w:afterAutospacing="1" w:line="240" w:lineRule="auto"/>
+        <w:rPr>
+          <w:rFonts w:ascii="Times New Roman" w:eastAsia="Times New Roman" w:hAnsi="Times New Roman" w:cs="Times New Roman"/>
+          <w:kern w:val="0"/>
+          <w14:ligatures w14:val="none"/>
+        </w:rPr>
+      </w:pPr>
+      <w:r>
+        <w:rPr>
+          <w:rFonts w:ascii="Times New Roman" w:eastAsia="Times New Roman" w:hAnsi="Times New Roman" w:cs="Times New Roman"/>
+          <w:kern w:val="0"/>
+          <w14:ligatures w14:val="none"/>
+        </w:rPr>
+        <w:t xml:space="preserve">Về cơ bản, đây là một sơ đồ ý tưởng để xây dựng </w:t>
+      </w:r>
+      <w:r>
+        <w:rPr>
+          <w:rFonts w:ascii="Times New Roman" w:eastAsia="Times New Roman" w:hAnsi="Times New Roman" w:cs="Times New Roman"/>
+          <w:b/>
+          <w:bCs/>
+          <w:kern w:val="0"/>
+          <w14:ligatures w14:val="none"/>
+        </w:rPr>
+        <w:t>Hệ thống Quản lý Vận tải (TMS)</w:t>
+      </w:r>
+      <w:r>
+        <w:rPr>
+          <w:rFonts w:ascii="Times New Roman" w:eastAsia="Times New Roman" w:hAnsi="Times New Roman" w:cs="Times New Roman"/>
+          <w:kern w:val="0"/>
+          <w14:ligatures w14:val="none"/>
+        </w:rPr>
+        <w:t xml:space="preserve"> hoặc quy trình kế toán nội bộ nhằm theo dõi hiệu quả kinh doanh của từng chuyến đi và từng đầu xe.</w:t>
+      </w:r>
+    </w:p>
+    <w:p>
+      <w:pPr>
+        <w:spacing w:before="100" w:beforeAutospacing="1" w:after="100" w:afterAutospacing="1" w:line="240" w:lineRule="auto"/>
+        <w:rPr>
+          <w:rFonts w:ascii="Times New Roman" w:eastAsia="Times New Roman" w:hAnsi="Times New Roman" w:cs="Times New Roman"/>
+          <w:kern w:val="0"/>
+          <w14:ligatures w14:val="none"/>
+        </w:rPr>
+      </w:pPr>
+      <w:r>
+        <w:rPr>
+          <w:rFonts w:ascii="Times New Roman" w:eastAsia="Times New Roman" w:hAnsi="Times New Roman" w:cs="Times New Roman"/>
+          <w:kern w:val="0"/>
+          <w14:ligatures w14:val="none"/>
+        </w:rPr>
+        <w:t>Dưới đây là phần phân tích chi tiết quy trình kinh doanh này:</w:t>
+      </w:r>
+    </w:p>
+    <w:p>
+      <w:pPr>
+        <w:spacing w:before="100" w:beforeAutospacing="1" w:after="100" w:afterAutospacing="1" w:line="240" w:lineRule="auto"/>
+        <w:outlineLvl w:val="2"/>
+        <w:rPr>
+          <w:rFonts w:ascii="Times New Roman" w:eastAsia="Times New Roman" w:hAnsi="Times New Roman" w:cs="Times New Roman"/>
+          <w:b/>
+          <w:bCs/>
+          <w:kern w:val="0"/>
+          <w:sz w:val="27"/>
+          <w:szCs w:val="27"/>
+          <w14:ligatures w14:val="none"/>
+        </w:rPr>
+      </w:pPr>
+      <w:r>
+        <w:rPr>
+          <w:rFonts w:ascii="Times New Roman" w:eastAsia="Times New Roman" w:hAnsi="Times New Roman" w:cs="Times New Roman"/>
+          <w:b/>
+          <w:bCs/>
+          <w:kern w:val="0"/>
+          <w:sz w:val="27"/>
+          <w:szCs w:val="27"/>
+          <w14:ligatures w14:val="none"/>
+        </w:rPr>
+        <w:lastRenderedPageBreak/>
+        <w:t>1. Luồng Vận hành &amp; Kế toán Cốt lõi (Nhóm bên trái)</w:t>
+      </w:r>
+    </w:p>
+    <w:p>
+      <w:pPr>
+        <w:spacing w:before="100" w:beforeAutospacing="1" w:after="100" w:afterAutospacing="1" w:line="240" w:lineRule="auto"/>
+        <w:rPr>
+          <w:rFonts w:ascii="Times New Roman" w:eastAsia="Times New Roman" w:hAnsi="Times New Roman" w:cs="Times New Roman"/>
+          <w:kern w:val="0"/>
+          <w14:ligatures w14:val="none"/>
+        </w:rPr>
+      </w:pPr>
+      <w:r>
+        <w:rPr>
+          <w:rFonts w:ascii="Times New Roman" w:eastAsia="Times New Roman" w:hAnsi="Times New Roman" w:cs="Times New Roman"/>
+          <w:kern w:val="0"/>
+          <w14:ligatures w14:val="none"/>
+        </w:rPr>
+        <w:t>Phần này sơ đồ hóa cách một kế hoạch vận tải tạo ra doanh thu, phát sinh chi phí và cuối cùng kết xuất ra báo cáo Lãi/Lỗ.</w:t>
+      </w:r>
+    </w:p>
+    <w:p>
+      <w:pPr>
+        <w:numPr>
+          <w:ilvl w:val="0"/>
+          <w:numId w:val="3"/>
+        </w:numPr>
+        <w:spacing w:before="100" w:beforeAutospacing="1" w:after="100" w:afterAutospacing="1" w:line="240" w:lineRule="auto"/>
+        <w:rPr>
+          <w:rFonts w:ascii="Times New Roman" w:eastAsia="Times New Roman" w:hAnsi="Times New Roman" w:cs="Times New Roman"/>
+          <w:kern w:val="0"/>
+          <w14:ligatures w14:val="none"/>
+        </w:rPr>
+      </w:pPr>
+      <w:r>
+        <w:rPr>
+          <w:rFonts w:ascii="Times New Roman" w:eastAsia="Times New Roman" w:hAnsi="Times New Roman" w:cs="Times New Roman"/>
+          <w:b/>
+          <w:bCs/>
+          <w:kern w:val="0"/>
+          <w14:ligatures w14:val="none"/>
+        </w:rPr>
+        <w:t>Kế hoạch O/C (Order / Kế hoạch điều hành):</w:t>
+      </w:r>
+      <w:r>
+        <w:rPr>
+          <w:rFonts w:ascii="Times New Roman" w:eastAsia="Times New Roman" w:hAnsi="Times New Roman" w:cs="Times New Roman"/>
+          <w:kern w:val="0"/>
+          <w14:ligatures w14:val="none"/>
+        </w:rPr>
+        <w:t xml:space="preserve"> Đây là điểm khởi đầu. Nó đại diện cho kế hoạch vận chuyển hoặc đơn hàng ban đầu. Từ kế hoạch này, quy trình rẽ nhánh thành các khoản doanh thu, chi phí nội bộ và quá trình vận hành xe.</w:t>
+      </w:r>
+    </w:p>
+    <w:p>
+      <w:pPr>
+        <w:numPr>
+          <w:ilvl w:val="0"/>
+          <w:numId w:val="3"/>
+        </w:numPr>
+        <w:spacing w:before="100" w:beforeAutospacing="1" w:after="100" w:afterAutospacing="1" w:line="240" w:lineRule="auto"/>
+        <w:rPr>
+          <w:rFonts w:ascii="Times New Roman" w:eastAsia="Times New Roman" w:hAnsi="Times New Roman" w:cs="Times New Roman"/>
+          <w:kern w:val="0"/>
+          <w14:ligatures w14:val="none"/>
+        </w:rPr>
+      </w:pPr>
+      <w:r>
+        <w:rPr>
+          <w:rFonts w:ascii="Times New Roman" w:eastAsia="Times New Roman" w:hAnsi="Times New Roman" w:cs="Times New Roman"/>
+          <w:b/>
+          <w:bCs/>
+          <w:kern w:val="0"/>
+          <w14:ligatures w14:val="none"/>
+        </w:rPr>
+        <w:t>Dòng Doanh thu:</w:t>
+      </w:r>
+    </w:p>
+    <w:p>
+      <w:pPr>
+        <w:numPr>
+          <w:ilvl w:val="1"/>
+          <w:numId w:val="3"/>
+        </w:numPr>
+        <w:spacing w:before="100" w:beforeAutospacing="1" w:after="100" w:afterAutospacing="1" w:line="240" w:lineRule="auto"/>
+        <w:rPr>
+          <w:rFonts w:ascii="Times New Roman" w:eastAsia="Times New Roman" w:hAnsi="Times New Roman" w:cs="Times New Roman"/>
+          <w:kern w:val="0"/>
+          <w14:ligatures w14:val="none"/>
+        </w:rPr>
+      </w:pPr>
+      <w:r>
+        <w:rPr>
+          <w:rFonts w:ascii="Times New Roman" w:eastAsia="Times New Roman" w:hAnsi="Times New Roman" w:cs="Times New Roman"/>
+          <w:b/>
+          <w:bCs/>
+          <w:kern w:val="0"/>
+          <w14:ligatures w14:val="none"/>
+        </w:rPr>
+        <w:t>Giá bán:</w:t>
+      </w:r>
+      <w:r>
+        <w:rPr>
+          <w:rFonts w:ascii="Times New Roman" w:eastAsia="Times New Roman" w:hAnsi="Times New Roman" w:cs="Times New Roman"/>
+          <w:kern w:val="0"/>
+          <w14:ligatures w14:val="none"/>
+        </w:rPr>
+        <w:t xml:space="preserve"> Mức giá cước báo cho khách hàng.</w:t>
+      </w:r>
+    </w:p>
+    <w:p>
+      <w:pPr>
+        <w:numPr>
+          <w:ilvl w:val="1"/>
+          <w:numId w:val="3"/>
+        </w:numPr>
+        <w:spacing w:before="100" w:beforeAutospacing="1" w:after="100" w:afterAutospacing="1" w:line="240" w:lineRule="auto"/>
+        <w:rPr>
+          <w:rFonts w:ascii="Times New Roman" w:eastAsia="Times New Roman" w:hAnsi="Times New Roman" w:cs="Times New Roman"/>
+          <w:kern w:val="0"/>
+          <w14:ligatures w14:val="none"/>
+        </w:rPr>
+      </w:pPr>
+      <w:r>
+        <w:rPr>
+          <w:rFonts w:ascii="Times New Roman" w:eastAsia="Times New Roman" w:hAnsi="Times New Roman" w:cs="Times New Roman"/>
+          <w:kern w:val="0"/>
+          <w14:ligatures w14:val="none"/>
+        </w:rPr>
+        <w:t xml:space="preserve">Khoản này trực tiếp chuyển thành </w:t>
+      </w:r>
+      <w:r>
+        <w:rPr>
+          <w:rFonts w:ascii="Times New Roman" w:eastAsia="Times New Roman" w:hAnsi="Times New Roman" w:cs="Times New Roman"/>
+          <w:b/>
+          <w:bCs/>
+          <w:kern w:val="0"/>
+          <w14:ligatures w14:val="none"/>
+        </w:rPr>
+        <w:t>DT xe (Doanh thu xe)</w:t>
+      </w:r>
+      <w:r>
+        <w:rPr>
+          <w:rFonts w:ascii="Times New Roman" w:eastAsia="Times New Roman" w:hAnsi="Times New Roman" w:cs="Times New Roman"/>
+          <w:kern w:val="0"/>
+          <w14:ligatures w14:val="none"/>
+        </w:rPr>
+        <w:t xml:space="preserve"> và ghi nhận một khoản </w:t>
+      </w:r>
+      <w:r>
+        <w:rPr>
+          <w:rFonts w:ascii="Times New Roman" w:eastAsia="Times New Roman" w:hAnsi="Times New Roman" w:cs="Times New Roman"/>
+          <w:b/>
+          <w:bCs/>
+          <w:kern w:val="0"/>
+          <w14:ligatures w14:val="none"/>
+        </w:rPr>
+        <w:t>Phải thu KH (Phải thu khách hàng)</w:t>
+      </w:r>
+      <w:r>
+        <w:rPr>
+          <w:rFonts w:ascii="Times New Roman" w:eastAsia="Times New Roman" w:hAnsi="Times New Roman" w:cs="Times New Roman"/>
+          <w:kern w:val="0"/>
+          <w14:ligatures w14:val="none"/>
+        </w:rPr>
+        <w:t>.</w:t>
+      </w:r>
+    </w:p>
+    <w:p>
+      <w:pPr>
+        <w:numPr>
+          <w:ilvl w:val="0"/>
+          <w:numId w:val="3"/>
+        </w:numPr>
+        <w:spacing w:before="100" w:beforeAutospacing="1" w:after="100" w:afterAutospacing="1" w:line="240" w:lineRule="auto"/>
+        <w:rPr>
+          <w:rFonts w:ascii="Times New Roman" w:eastAsia="Times New Roman" w:hAnsi="Times New Roman" w:cs="Times New Roman"/>
+          <w:kern w:val="0"/>
+          <w14:ligatures w14:val="none"/>
+        </w:rPr>
+      </w:pPr>
+      <w:r>
+        <w:rPr>
+          <w:rFonts w:ascii="Times New Roman" w:eastAsia="Times New Roman" w:hAnsi="Times New Roman" w:cs="Times New Roman"/>
+          <w:b/>
+          <w:bCs/>
+          <w:kern w:val="0"/>
+          <w14:ligatures w14:val="none"/>
+        </w:rPr>
+        <w:t>Dòng Chi phí:</w:t>
+      </w:r>
+    </w:p>
+    <w:p>
+      <w:pPr>
+        <w:numPr>
+          <w:ilvl w:val="1"/>
+          <w:numId w:val="3"/>
+        </w:numPr>
+        <w:spacing w:before="100" w:beforeAutospacing="1" w:after="100" w:afterAutospacing="1" w:line="240" w:lineRule="auto"/>
+        <w:rPr>
+          <w:rFonts w:ascii="Times New Roman" w:eastAsia="Times New Roman" w:hAnsi="Times New Roman" w:cs="Times New Roman"/>
+          <w:kern w:val="0"/>
+          <w14:ligatures w14:val="none"/>
+        </w:rPr>
+      </w:pPr>
+      <w:r>
+        <w:rPr>
+          <w:rFonts w:ascii="Times New Roman" w:eastAsia="Times New Roman" w:hAnsi="Times New Roman" w:cs="Times New Roman"/>
+          <w:b/>
+          <w:bCs/>
+          <w:kern w:val="0"/>
+          <w14:ligatures w14:val="none"/>
+        </w:rPr>
+        <w:t>Xe vận chuyển:</w:t>
+      </w:r>
+      <w:r>
+        <w:rPr>
+          <w:rFonts w:ascii="Times New Roman" w:eastAsia="Times New Roman" w:hAnsi="Times New Roman" w:cs="Times New Roman"/>
+          <w:kern w:val="0"/>
+          <w14:ligatures w14:val="none"/>
+        </w:rPr>
+        <w:t xml:space="preserve"> Việc điều động đội xe của công ty sẽ phát sinh các chi phí vận hành trực tiếp.</w:t>
+      </w:r>
+    </w:p>
+    <w:p>
+      <w:pPr>
+        <w:numPr>
+          <w:ilvl w:val="1"/>
+          <w:numId w:val="3"/>
+        </w:numPr>
+        <w:spacing w:before="100" w:beforeAutospacing="1" w:after="100" w:afterAutospacing="1" w:line="240" w:lineRule="auto"/>
+        <w:rPr>
+          <w:rFonts w:ascii="Times New Roman" w:eastAsia="Times New Roman" w:hAnsi="Times New Roman" w:cs="Times New Roman"/>
+          <w:kern w:val="0"/>
+          <w14:ligatures w14:val="none"/>
+        </w:rPr>
+      </w:pPr>
+      <w:r>
+        <w:rPr>
+          <w:rFonts w:ascii="Times New Roman" w:eastAsia="Times New Roman" w:hAnsi="Times New Roman" w:cs="Times New Roman"/>
+          <w:kern w:val="0"/>
+          <w14:ligatures w14:val="none"/>
+        </w:rPr>
+        <w:t xml:space="preserve">Sơ đồ chia nhỏ các chi phí trực tiếp này thành các khoản mục cụ thể: </w:t>
+      </w:r>
+      <w:r>
+        <w:rPr>
+          <w:rFonts w:ascii="Times New Roman" w:eastAsia="Times New Roman" w:hAnsi="Times New Roman" w:cs="Times New Roman"/>
+          <w:b/>
+          <w:bCs/>
+          <w:kern w:val="0"/>
+          <w14:ligatures w14:val="none"/>
+        </w:rPr>
+        <w:t>Điện</w:t>
+      </w:r>
+      <w:r>
+        <w:rPr>
+          <w:rFonts w:ascii="Times New Roman" w:eastAsia="Times New Roman" w:hAnsi="Times New Roman" w:cs="Times New Roman"/>
+          <w:kern w:val="0"/>
+          <w14:ligatures w14:val="none"/>
+        </w:rPr>
+        <w:t xml:space="preserve"> (Thường là phụ cấp điện thoại/liên lạc cho tài xế), </w:t>
+      </w:r>
+      <w:r>
+        <w:rPr>
+          <w:rFonts w:ascii="Times New Roman" w:eastAsia="Times New Roman" w:hAnsi="Times New Roman" w:cs="Times New Roman"/>
+          <w:b/>
+          <w:bCs/>
+          <w:kern w:val="0"/>
+          <w14:ligatures w14:val="none"/>
+        </w:rPr>
+        <w:t>Lương</w:t>
+      </w:r>
+      <w:r>
+        <w:rPr>
+          <w:rFonts w:ascii="Times New Roman" w:eastAsia="Times New Roman" w:hAnsi="Times New Roman" w:cs="Times New Roman"/>
+          <w:kern w:val="0"/>
+          <w14:ligatures w14:val="none"/>
+        </w:rPr>
+        <w:t xml:space="preserve"> (Lương tài xế), </w:t>
+      </w:r>
+      <w:r>
+        <w:rPr>
+          <w:rFonts w:ascii="Times New Roman" w:eastAsia="Times New Roman" w:hAnsi="Times New Roman" w:cs="Times New Roman"/>
+          <w:b/>
+          <w:bCs/>
+          <w:kern w:val="0"/>
+          <w14:ligatures w14:val="none"/>
+        </w:rPr>
+        <w:t>Dầu</w:t>
+      </w:r>
+      <w:r>
+        <w:rPr>
+          <w:rFonts w:ascii="Times New Roman" w:eastAsia="Times New Roman" w:hAnsi="Times New Roman" w:cs="Times New Roman"/>
+          <w:kern w:val="0"/>
+          <w14:ligatures w14:val="none"/>
+        </w:rPr>
+        <w:t xml:space="preserve"> (Chi phí nhiên liệu), và </w:t>
+      </w:r>
+      <w:r>
+        <w:rPr>
+          <w:rFonts w:ascii="Times New Roman" w:eastAsia="Times New Roman" w:hAnsi="Times New Roman" w:cs="Times New Roman"/>
+          <w:b/>
+          <w:bCs/>
+          <w:kern w:val="0"/>
+          <w14:ligatures w14:val="none"/>
+        </w:rPr>
+        <w:t>Sửa chữa / Phụ tùng</w:t>
+      </w:r>
+      <w:r>
+        <w:rPr>
+          <w:rFonts w:ascii="Times New Roman" w:eastAsia="Times New Roman" w:hAnsi="Times New Roman" w:cs="Times New Roman"/>
+          <w:kern w:val="0"/>
+          <w14:ligatures w14:val="none"/>
+        </w:rPr>
+        <w:t>.</w:t>
+      </w:r>
+    </w:p>
+    <w:p>
+      <w:pPr>
+        <w:numPr>
+          <w:ilvl w:val="1"/>
+          <w:numId w:val="3"/>
+        </w:numPr>
+        <w:spacing w:before="100" w:beforeAutospacing="1" w:after="100" w:afterAutospacing="1" w:line="240" w:lineRule="auto"/>
+        <w:rPr>
+          <w:rFonts w:ascii="Times New Roman" w:eastAsia="Times New Roman" w:hAnsi="Times New Roman" w:cs="Times New Roman"/>
+          <w:kern w:val="0"/>
+          <w14:ligatures w14:val="none"/>
+        </w:rPr>
+      </w:pPr>
+      <w:r>
+        <w:rPr>
+          <w:rFonts w:ascii="Times New Roman" w:eastAsia="Times New Roman" w:hAnsi="Times New Roman" w:cs="Times New Roman"/>
+          <w:b/>
+          <w:bCs/>
+          <w:kern w:val="0"/>
+          <w14:ligatures w14:val="none"/>
+        </w:rPr>
+        <w:t>Phí nội bộ, DV/F (Phí nội bộ, Dịch vụ / Cước phí):</w:t>
+      </w:r>
+      <w:r>
+        <w:rPr>
+          <w:rFonts w:ascii="Times New Roman" w:eastAsia="Times New Roman" w:hAnsi="Times New Roman" w:cs="Times New Roman"/>
+          <w:kern w:val="0"/>
+          <w14:ligatures w14:val="none"/>
+        </w:rPr>
+        <w:t xml:space="preserve"> Các chi phí quản lý vận hành hoặc dịch vụ phát sinh thêm.</w:t>
+      </w:r>
+    </w:p>
+    <w:p>
+      <w:pPr>
+        <w:numPr>
+          <w:ilvl w:val="1"/>
+          <w:numId w:val="3"/>
+        </w:numPr>
+        <w:spacing w:before="100" w:beforeAutospacing="1" w:after="100" w:afterAutospacing="1" w:line="240" w:lineRule="auto"/>
+        <w:rPr>
+          <w:rFonts w:ascii="Times New Roman" w:eastAsia="Times New Roman" w:hAnsi="Times New Roman" w:cs="Times New Roman"/>
+          <w:kern w:val="0"/>
+          <w14:ligatures w14:val="none"/>
+        </w:rPr>
+      </w:pPr>
+      <w:r>
+        <w:rPr>
+          <w:rFonts w:ascii="Times New Roman" w:eastAsia="Times New Roman" w:hAnsi="Times New Roman" w:cs="Times New Roman"/>
+          <w:b/>
+          <w:bCs/>
+          <w:kern w:val="0"/>
+          <w14:ligatures w14:val="none"/>
+        </w:rPr>
+        <w:t>Giá cước mua:</w:t>
+      </w:r>
+      <w:r>
+        <w:rPr>
+          <w:rFonts w:ascii="Times New Roman" w:eastAsia="Times New Roman" w:hAnsi="Times New Roman" w:cs="Times New Roman"/>
+          <w:kern w:val="0"/>
+          <w14:ligatures w14:val="none"/>
+        </w:rPr>
+        <w:t xml:space="preserve"> Nếu NePO không dùng xe nhà mà thuê ngoài (subcontractor), đây chính là chi phí mua lại dịch vụ vận tải đó.</w:t>
+      </w:r>
+    </w:p>
+    <w:p>
+      <w:pPr>
+        <w:numPr>
+          <w:ilvl w:val="1"/>
+          <w:numId w:val="3"/>
+        </w:numPr>
+        <w:spacing w:before="100" w:beforeAutospacing="1" w:after="100" w:afterAutospacing="1" w:line="240" w:lineRule="auto"/>
+        <w:rPr>
+          <w:rFonts w:ascii="Times New Roman" w:eastAsia="Times New Roman" w:hAnsi="Times New Roman" w:cs="Times New Roman"/>
+          <w:kern w:val="0"/>
+          <w14:ligatures w14:val="none"/>
+        </w:rPr>
+      </w:pPr>
+      <w:r>
+        <w:rPr>
+          <w:rFonts w:ascii="Times New Roman" w:eastAsia="Times New Roman" w:hAnsi="Times New Roman" w:cs="Times New Roman"/>
+          <w:kern w:val="0"/>
+          <w14:ligatures w14:val="none"/>
+        </w:rPr>
+        <w:t xml:space="preserve">Tất cả các khoản trên đều đổ dồn về </w:t>
+      </w:r>
+      <w:r>
+        <w:rPr>
+          <w:rFonts w:ascii="Times New Roman" w:eastAsia="Times New Roman" w:hAnsi="Times New Roman" w:cs="Times New Roman"/>
+          <w:b/>
+          <w:bCs/>
+          <w:kern w:val="0"/>
+          <w14:ligatures w14:val="none"/>
+        </w:rPr>
+        <w:t>Chi phí xe</w:t>
+      </w:r>
+      <w:r>
+        <w:rPr>
+          <w:rFonts w:ascii="Times New Roman" w:eastAsia="Times New Roman" w:hAnsi="Times New Roman" w:cs="Times New Roman"/>
+          <w:kern w:val="0"/>
+          <w14:ligatures w14:val="none"/>
+        </w:rPr>
+        <w:t>.</w:t>
+      </w:r>
+    </w:p>
+    <w:p>
+      <w:pPr>
+        <w:numPr>
+          <w:ilvl w:val="0"/>
+          <w:numId w:val="3"/>
+        </w:numPr>
+        <w:spacing w:before="100" w:beforeAutospacing="1" w:after="100" w:afterAutospacing="1" w:line="240" w:lineRule="auto"/>
+        <w:rPr>
+          <w:rFonts w:ascii="Times New Roman" w:eastAsia="Times New Roman" w:hAnsi="Times New Roman" w:cs="Times New Roman"/>
+          <w:kern w:val="0"/>
+          <w14:ligatures w14:val="none"/>
+        </w:rPr>
+      </w:pPr>
+      <w:r>
+        <w:rPr>
+          <w:rFonts w:ascii="Times New Roman" w:eastAsia="Times New Roman" w:hAnsi="Times New Roman" w:cs="Times New Roman"/>
+          <w:b/>
+          <w:bCs/>
+          <w:kern w:val="0"/>
+          <w14:ligatures w14:val="none"/>
+        </w:rPr>
+        <w:t>Đầu ra (Báo cáo):</w:t>
+      </w:r>
+    </w:p>
+    <w:p>
+      <w:pPr>
+        <w:numPr>
+          <w:ilvl w:val="1"/>
+          <w:numId w:val="3"/>
+        </w:numPr>
+        <w:spacing w:before="100" w:beforeAutospacing="1" w:after="100" w:afterAutospacing="1" w:line="240" w:lineRule="auto"/>
+        <w:rPr>
+          <w:rFonts w:ascii="Times New Roman" w:eastAsia="Times New Roman" w:hAnsi="Times New Roman" w:cs="Times New Roman"/>
+          <w:kern w:val="0"/>
+          <w14:ligatures w14:val="none"/>
+        </w:rPr>
+      </w:pPr>
+      <w:r>
+        <w:rPr>
+          <w:rFonts w:ascii="Times New Roman" w:eastAsia="Times New Roman" w:hAnsi="Times New Roman" w:cs="Times New Roman"/>
+          <w:kern w:val="0"/>
+          <w14:ligatures w14:val="none"/>
+        </w:rPr>
+        <w:t xml:space="preserve">Doanh thu và Chi phí hợp nhất ở cuối sơ đồ để tạo thành </w:t>
+      </w:r>
+      <w:r>
+        <w:rPr>
+          <w:rFonts w:ascii="Times New Roman" w:eastAsia="Times New Roman" w:hAnsi="Times New Roman" w:cs="Times New Roman"/>
+          <w:b/>
+          <w:bCs/>
+          <w:kern w:val="0"/>
+          <w14:ligatures w14:val="none"/>
+        </w:rPr>
+        <w:t>Báo cáo DT/CP xe (Báo cáo Doanh thu / Chi phí xe)</w:t>
+      </w:r>
+      <w:r>
+        <w:rPr>
+          <w:rFonts w:ascii="Times New Roman" w:eastAsia="Times New Roman" w:hAnsi="Times New Roman" w:cs="Times New Roman"/>
+          <w:kern w:val="0"/>
+          <w14:ligatures w14:val="none"/>
+        </w:rPr>
+        <w:t>. Đây là bảng điều khiển tài chính giúp công ty xác định xem một đầu xe hoặc một chuyến đi cụ thể có mang lại lợi nhuận hay không.</w:t>
+      </w:r>
+    </w:p>
+    <w:p>
+      <w:pPr>
+        <w:spacing w:before="100" w:beforeAutospacing="1" w:after="100" w:afterAutospacing="1" w:line="240" w:lineRule="auto"/>
+        <w:outlineLvl w:val="2"/>
+        <w:rPr>
+          <w:rFonts w:ascii="Times New Roman" w:eastAsia="Times New Roman" w:hAnsi="Times New Roman" w:cs="Times New Roman"/>
+          <w:b/>
+          <w:bCs/>
+          <w:kern w:val="0"/>
+          <w:sz w:val="27"/>
+          <w:szCs w:val="27"/>
+          <w14:ligatures w14:val="none"/>
+        </w:rPr>
+      </w:pPr>
+      <w:r>
+        <w:rPr>
+          <w:rFonts w:ascii="Times New Roman" w:eastAsia="Times New Roman" w:hAnsi="Times New Roman" w:cs="Times New Roman"/>
+          <w:b/>
+          <w:bCs/>
+          <w:kern w:val="0"/>
+          <w:sz w:val="27"/>
+          <w:szCs w:val="27"/>
+          <w14:ligatures w14:val="none"/>
+        </w:rPr>
+        <w:t>2. Các Tác vụ Hành chính &amp; Quản lý (Nhóm bên phải)</w:t>
+      </w:r>
+    </w:p>
+    <w:p>
+      <w:pPr>
+        <w:spacing w:before="100" w:beforeAutospacing="1" w:after="100" w:afterAutospacing="1" w:line="240" w:lineRule="auto"/>
+        <w:rPr>
+          <w:rFonts w:ascii="Times New Roman" w:eastAsia="Times New Roman" w:hAnsi="Times New Roman" w:cs="Times New Roman"/>
+          <w:kern w:val="0"/>
+          <w14:ligatures w14:val="none"/>
+        </w:rPr>
+      </w:pPr>
+      <w:r>
+        <w:rPr>
+          <w:rFonts w:ascii="Times New Roman" w:eastAsia="Times New Roman" w:hAnsi="Times New Roman" w:cs="Times New Roman"/>
+          <w:kern w:val="0"/>
+          <w14:ligatures w14:val="none"/>
+        </w:rPr>
+        <w:t>Phía bên phải của trang giấy liệt kê các nghiệp vụ hàng ngày cần thiết để duy trì hoạt động của đội xe và cân đối sổ sách.</w:t>
+      </w:r>
+    </w:p>
+    <w:p>
+      <w:pPr>
+        <w:numPr>
+          <w:ilvl w:val="0"/>
+          <w:numId w:val="4"/>
+        </w:numPr>
+        <w:spacing w:before="100" w:beforeAutospacing="1" w:after="100" w:afterAutospacing="1" w:line="240" w:lineRule="auto"/>
+        <w:rPr>
+          <w:rFonts w:ascii="Times New Roman" w:eastAsia="Times New Roman" w:hAnsi="Times New Roman" w:cs="Times New Roman"/>
+          <w:kern w:val="0"/>
+          <w14:ligatures w14:val="none"/>
+        </w:rPr>
+      </w:pPr>
+      <w:r>
+        <w:rPr>
+          <w:rFonts w:ascii="Times New Roman" w:eastAsia="Times New Roman" w:hAnsi="Times New Roman" w:cs="Times New Roman"/>
+          <w:b/>
+          <w:bCs/>
+          <w:kern w:val="0"/>
+          <w14:ligatures w14:val="none"/>
+        </w:rPr>
+        <w:t>Nhận công lệnh lái xe:</w:t>
+      </w:r>
+      <w:r>
+        <w:rPr>
+          <w:rFonts w:ascii="Times New Roman" w:eastAsia="Times New Roman" w:hAnsi="Times New Roman" w:cs="Times New Roman"/>
+          <w:kern w:val="0"/>
+          <w14:ligatures w14:val="none"/>
+        </w:rPr>
+        <w:t xml:space="preserve"> Lệnh điều xe (bản cứng hoặc phần mềm) được giao cho tài xế để thực hiện chuyến hàng.</w:t>
+      </w:r>
+    </w:p>
+    <w:p>
+      <w:pPr>
+        <w:numPr>
+          <w:ilvl w:val="0"/>
+          <w:numId w:val="4"/>
+        </w:numPr>
+        <w:spacing w:before="100" w:beforeAutospacing="1" w:after="100" w:afterAutospacing="1" w:line="240" w:lineRule="auto"/>
+        <w:rPr>
+          <w:rFonts w:ascii="Times New Roman" w:eastAsia="Times New Roman" w:hAnsi="Times New Roman" w:cs="Times New Roman"/>
+          <w:kern w:val="0"/>
+          <w14:ligatures w14:val="none"/>
+        </w:rPr>
+      </w:pPr>
+      <w:r>
+        <w:rPr>
+          <w:rFonts w:ascii="Times New Roman" w:eastAsia="Times New Roman" w:hAnsi="Times New Roman" w:cs="Times New Roman"/>
+          <w:b/>
+          <w:bCs/>
+          <w:kern w:val="0"/>
+          <w14:ligatures w14:val="none"/>
+        </w:rPr>
+        <w:t>Tạm ứng / H.toán (Hoàn toán):</w:t>
+      </w:r>
+      <w:r>
+        <w:rPr>
+          <w:rFonts w:ascii="Times New Roman" w:eastAsia="Times New Roman" w:hAnsi="Times New Roman" w:cs="Times New Roman"/>
+          <w:kern w:val="0"/>
+          <w14:ligatures w14:val="none"/>
+        </w:rPr>
+        <w:t xml:space="preserve"> Tại Việt Nam, tài xế xe tải thường cần ứng trước tiền mặt cho các chi phí dọc đường (trạm thu phí, luật lá, vá lốp...). Nút này đại diện cho quy trình chi tiền tạm ứng và sau đó hoàn ứng (đối chiếu hóa đơn/chứng từ) khi chuyến đi kết thúc.</w:t>
+      </w:r>
+    </w:p>
+    <w:p>
+      <w:pPr>
+        <w:numPr>
+          <w:ilvl w:val="0"/>
+          <w:numId w:val="4"/>
+        </w:numPr>
+        <w:spacing w:before="100" w:beforeAutospacing="1" w:after="100" w:afterAutospacing="1" w:line="240" w:lineRule="auto"/>
+        <w:rPr>
+          <w:rFonts w:ascii="Times New Roman" w:eastAsia="Times New Roman" w:hAnsi="Times New Roman" w:cs="Times New Roman"/>
+          <w:kern w:val="0"/>
+          <w14:ligatures w14:val="none"/>
+        </w:rPr>
+      </w:pPr>
+      <w:r>
+        <w:rPr>
+          <w:rFonts w:ascii="Times New Roman" w:eastAsia="Times New Roman" w:hAnsi="Times New Roman" w:cs="Times New Roman"/>
+          <w:b/>
+          <w:bCs/>
+          <w:kern w:val="0"/>
+          <w14:ligatures w14:val="none"/>
+        </w:rPr>
+        <w:t>Nhắc lịch bảo dưỡng xe:</w:t>
+      </w:r>
+      <w:r>
+        <w:rPr>
+          <w:rFonts w:ascii="Times New Roman" w:eastAsia="Times New Roman" w:hAnsi="Times New Roman" w:cs="Times New Roman"/>
+          <w:kern w:val="0"/>
+          <w14:ligatures w14:val="none"/>
+        </w:rPr>
+        <w:t xml:space="preserve"> Một tính năng quản lý đội xe quan trọng để theo dõi thời hạn bảo trì, giúp giảm thiểu rủi ro xe hỏng hóc giữa đường.</w:t>
+      </w:r>
+    </w:p>
+    <w:p>
+      <w:pPr>
+        <w:numPr>
+          <w:ilvl w:val="0"/>
+          <w:numId w:val="4"/>
+        </w:numPr>
+        <w:spacing w:before="100" w:beforeAutospacing="1" w:after="100" w:afterAutospacing="1" w:line="240" w:lineRule="auto"/>
+        <w:rPr>
+          <w:rFonts w:ascii="Times New Roman" w:eastAsia="Times New Roman" w:hAnsi="Times New Roman" w:cs="Times New Roman"/>
+          <w:kern w:val="0"/>
+          <w14:ligatures w14:val="none"/>
+        </w:rPr>
+      </w:pPr>
+      <w:r>
+        <w:rPr>
+          <w:rFonts w:ascii="Times New Roman" w:eastAsia="Times New Roman" w:hAnsi="Times New Roman" w:cs="Times New Roman"/>
+          <w:b/>
+          <w:bCs/>
+          <w:kern w:val="0"/>
+          <w14:ligatures w14:val="none"/>
+        </w:rPr>
+        <w:t>Phải trả ng bán, đối tác (Phải trả người bán, đối tác):</w:t>
+      </w:r>
+      <w:r>
+        <w:rPr>
+          <w:rFonts w:ascii="Times New Roman" w:eastAsia="Times New Roman" w:hAnsi="Times New Roman" w:cs="Times New Roman"/>
+          <w:kern w:val="0"/>
+          <w14:ligatures w14:val="none"/>
+        </w:rPr>
+        <w:t xml:space="preserve"> Quản lý công nợ đối với các nhà cung cấp bên ngoài, chẳng hạn như đối tác xe thuê ngoài, trạm xăng dầu, hoặc xưởng sửa chữa/phụ tùng.</w:t>
+      </w:r>
+    </w:p>
+    <w:p>
+      <w:pPr>
+        <w:spacing w:before="100" w:beforeAutospacing="1" w:after="100" w:afterAutospacing="1" w:line="240" w:lineRule="auto"/>
+        <w:rPr>
+          <w:rFonts w:ascii="Times New Roman" w:eastAsia="Times New Roman" w:hAnsi="Times New Roman" w:cs="Times New Roman"/>
+          <w:kern w:val="0"/>
+          <w14:ligatures w14:val="none"/>
+        </w:rPr>
+      </w:pPr>
+      <w:r>
+        <w:rPr>
+          <w:rFonts w:ascii="Times New Roman" w:eastAsia="Times New Roman" w:hAnsi="Times New Roman" w:cs="Times New Roman"/>
+          <w:b/>
+          <w:bCs/>
+          <w:kern w:val="0"/>
+          <w14:ligatures w14:val="none"/>
+        </w:rPr>
+        <w:lastRenderedPageBreak/>
+        <w:t>Tóm tắt Logic Kinh doanh</w:t>
+      </w:r>
+      <w:r>
+        <w:rPr>
+          <w:rFonts w:ascii="Times New Roman" w:eastAsia="Times New Roman" w:hAnsi="Times New Roman" w:cs="Times New Roman"/>
+          <w:kern w:val="0"/>
+          <w14:ligatures w14:val="none"/>
+        </w:rPr>
+        <w:t xml:space="preserve"> Quy trình này cho thấy với mỗi đơn hàng vận tải, NePO Corp muốn đối chiếu sát sao giữa doanh thu thu về và các chi phí vận hành thực tế của chiếc xe được chỉ định (nhiên liệu, lương, bảo dưỡng...) cũng như chi phí thuê ngoài. Đồng thời, hệ thống cũng phải giải quyết được các bài toán quản lý hàng ngày như tạm ứng cho tài xế, nhắc lịch bảo dưỡng xe và quản lý công nợ (phải thu/phải trả).</w:t>
+      </w:r>
+    </w:p>
+    <w:p/>
     <w:sectPr>
       <w:pgSz w:w="12240" w:h="15840"/>
       <w:pgMar w:top="1440" w:right="1440" w:bottom="1440" w:left="1440" w:header="720" w:footer="720" w:gutter="0"/>
@@ -908,6 +1713,304 @@
 <file path=word/numbering.xml><?xml version="1.0" encoding="utf-8"?>
 <w:numbering xmlns:wpc="http://schemas.microsoft.com/office/word/2010/wordprocessingCanvas" xmlns:cx="http://schemas.microsoft.com/office/drawing/2014/chartex" xmlns:cx1="http://schemas.microsoft.com/office/drawing/2015/9/8/chartex" xmlns:cx2="http://schemas.microsoft.com/office/drawing/2015/10/21/chartex" xmlns:cx3="http://schemas.microsoft.com/office/drawing/2016/5/9/chartex" xmlns:cx4="http://schemas.microsoft.com/office/drawing/2016/5/10/chartex" xmlns:cx5="http://schemas.microsoft.com/office/drawing/2016/5/11/chartex" xmlns:cx6="http://schemas.microsoft.com/office/drawing/2016/5/12/chartex" xmlns:cx7="http://schemas.microsoft.com/office/drawing/2016/5/13/chartex" xmlns:cx8="http://schemas.microsoft.com/office/drawing/2016/5/14/chartex" xmlns:mc="http://schemas.openxmlformats.org/markup-compatibility/2006" xmlns:aink="http://schemas.microsoft.com/office/drawing/2016/ink" xmlns:am3d="http://schemas.microsoft.com/office/drawing/2017/model3d" xmlns:o="urn:schemas-microsoft-com:office:office" xmlns:oel="http://schemas.microsoft.com/office/2019/extlst" xmlns:r="http://schemas.openxmlformats.org/officeDocument/2006/relationships" xmlns:m="http://schemas.openxmlformats.org/officeDocument/2006/math" xmlns:v="urn:schemas-microsoft-com:vml" xmlns:wp14="http://schemas.microsoft.com/office/word/2010/wordprocessingDrawing" xmlns:wp="http://schemas.openxmlformats.org/drawingml/2006/wordprocessingDrawing" xmlns:w10="urn:schemas-microsoft-com:office:word" xmlns:w="http://schemas.openxmlformats.org/wordprocessingml/2006/main" xmlns:w14="http://schemas.microsoft.com/office/word/2010/wordml" xmlns:w15="http://schemas.microsoft.com/office/word/2012/wordml" xmlns:w16cex="http://schemas.microsoft.com/office/word/2018/wordml/cex" xmlns:w16cid="http://schemas.microsoft.com/office/word/2016/wordml/cid" xmlns:w16="http://schemas.microsoft.com/office/word/2018/wordml" xmlns:w16du="http://schemas.microsoft.com/office/word/2023/wordml/word16du" xmlns:w16sdtdh="http://schemas.microsoft.com/office/word/2020/wordml/sdtdatahash" xmlns:w16sdtfl="http://schemas.microsoft.com/office/word/2024/wordml/sdtformatlock" xmlns:w16se="http://schemas.microsoft.com/office/word/2015/wordml/symex" xmlns:wpg="http://schemas.microsoft.com/office/word/2010/wordprocessingGroup" xmlns:wpi="http://schemas.microsoft.com/office/word/2010/wordprocessingInk" xmlns:wne="http://schemas.microsoft.com/office/word/2006/wordml" xmlns:wps="http://schemas.microsoft.com/office/word/2010/wordprocessingShape" mc:Ignorable="w14 w15 w16se w16cid w16 w16cex w16sdtdh w16sdtfl w16du wp14">
   <w:abstractNum w:abstractNumId="0" w15:restartNumberingAfterBreak="0">
+    <w:nsid w:val="19300797"/>
+    <w:multiLevelType w:val="multilevel"/>
+    <w:tmpl w:val="D7706E0A"/>
+    <w:lvl w:ilvl="0">
+      <w:start w:val="1"/>
+      <w:numFmt w:val="bullet"/>
+      <w:lvlText w:val=""/>
+      <w:lvlJc w:val="left"/>
+      <w:pPr>
+        <w:tabs>
+          <w:tab w:val="num" w:pos="720"/>
+        </w:tabs>
+        <w:ind w:left="720" w:hanging="360"/>
+      </w:pPr>
+      <w:rPr>
+        <w:rFonts w:ascii="Symbol" w:hAnsi="Symbol" w:hint="default"/>
+        <w:sz w:val="20"/>
+      </w:rPr>
+    </w:lvl>
+    <w:lvl w:ilvl="1" w:tentative="1">
+      <w:start w:val="1"/>
+      <w:numFmt w:val="bullet"/>
+      <w:lvlText w:val="o"/>
+      <w:lvlJc w:val="left"/>
+      <w:pPr>
+        <w:tabs>
+          <w:tab w:val="num" w:pos="1440"/>
+        </w:tabs>
+        <w:ind w:left="1440" w:hanging="360"/>
+      </w:pPr>
+      <w:rPr>
+        <w:rFonts w:ascii="Courier New" w:hAnsi="Courier New" w:hint="default"/>
+        <w:sz w:val="20"/>
+      </w:rPr>
+    </w:lvl>
+    <w:lvl w:ilvl="2" w:tentative="1">
+      <w:start w:val="1"/>
+      <w:numFmt w:val="bullet"/>
+      <w:lvlText w:val=""/>
+      <w:lvlJc w:val="left"/>
+      <w:pPr>
+        <w:tabs>
+          <w:tab w:val="num" w:pos="2160"/>
+        </w:tabs>
+        <w:ind w:left="2160" w:hanging="360"/>
+      </w:pPr>
+      <w:rPr>
+        <w:rFonts w:ascii="Wingdings" w:hAnsi="Wingdings" w:hint="default"/>
+        <w:sz w:val="20"/>
+      </w:rPr>
+    </w:lvl>
+    <w:lvl w:ilvl="3" w:tentative="1">
+      <w:start w:val="1"/>
+      <w:numFmt w:val="bullet"/>
+      <w:lvlText w:val=""/>
+      <w:lvlJc w:val="left"/>
+      <w:pPr>
+        <w:tabs>
+          <w:tab w:val="num" w:pos="2880"/>
+        </w:tabs>
+        <w:ind w:left="2880" w:hanging="360"/>
+      </w:pPr>
+      <w:rPr>
+        <w:rFonts w:ascii="Wingdings" w:hAnsi="Wingdings" w:hint="default"/>
+        <w:sz w:val="20"/>
+      </w:rPr>
+    </w:lvl>
+    <w:lvl w:ilvl="4" w:tentative="1">
+      <w:start w:val="1"/>
+      <w:numFmt w:val="bullet"/>
+      <w:lvlText w:val=""/>
+      <w:lvlJc w:val="left"/>
+      <w:pPr>
+        <w:tabs>
+          <w:tab w:val="num" w:pos="3600"/>
+        </w:tabs>
+        <w:ind w:left="3600" w:hanging="360"/>
+      </w:pPr>
+      <w:rPr>
+        <w:rFonts w:ascii="Wingdings" w:hAnsi="Wingdings" w:hint="default"/>
+        <w:sz w:val="20"/>
+      </w:rPr>
+    </w:lvl>
+    <w:lvl w:ilvl="5" w:tentative="1">
+      <w:start w:val="1"/>
+      <w:numFmt w:val="bullet"/>
+      <w:lvlText w:val=""/>
+      <w:lvlJc w:val="left"/>
+      <w:pPr>
+        <w:tabs>
+          <w:tab w:val="num" w:pos="4320"/>
+        </w:tabs>
+        <w:ind w:left="4320" w:hanging="360"/>
+      </w:pPr>
+      <w:rPr>
+        <w:rFonts w:ascii="Wingdings" w:hAnsi="Wingdings" w:hint="default"/>
+        <w:sz w:val="20"/>
+      </w:rPr>
+    </w:lvl>
+    <w:lvl w:ilvl="6" w:tentative="1">
+      <w:start w:val="1"/>
+      <w:numFmt w:val="bullet"/>
+      <w:lvlText w:val=""/>
+      <w:lvlJc w:val="left"/>
+      <w:pPr>
+        <w:tabs>
+          <w:tab w:val="num" w:pos="5040"/>
+        </w:tabs>
+        <w:ind w:left="5040" w:hanging="360"/>
+      </w:pPr>
+      <w:rPr>
+        <w:rFonts w:ascii="Wingdings" w:hAnsi="Wingdings" w:hint="default"/>
+        <w:sz w:val="20"/>
+      </w:rPr>
+    </w:lvl>
+    <w:lvl w:ilvl="7" w:tentative="1">
+      <w:start w:val="1"/>
+      <w:numFmt w:val="bullet"/>
+      <w:lvlText w:val=""/>
+      <w:lvlJc w:val="left"/>
+      <w:pPr>
+        <w:tabs>
+          <w:tab w:val="num" w:pos="5760"/>
+        </w:tabs>
+        <w:ind w:left="5760" w:hanging="360"/>
+      </w:pPr>
+      <w:rPr>
+        <w:rFonts w:ascii="Wingdings" w:hAnsi="Wingdings" w:hint="default"/>
+        <w:sz w:val="20"/>
+      </w:rPr>
+    </w:lvl>
+    <w:lvl w:ilvl="8" w:tentative="1">
+      <w:start w:val="1"/>
+      <w:numFmt w:val="bullet"/>
+      <w:lvlText w:val=""/>
+      <w:lvlJc w:val="left"/>
+      <w:pPr>
+        <w:tabs>
+          <w:tab w:val="num" w:pos="6480"/>
+        </w:tabs>
+        <w:ind w:left="6480" w:hanging="360"/>
+      </w:pPr>
+      <w:rPr>
+        <w:rFonts w:ascii="Wingdings" w:hAnsi="Wingdings" w:hint="default"/>
+        <w:sz w:val="20"/>
+      </w:rPr>
+    </w:lvl>
+  </w:abstractNum>
+  <w:abstractNum w:abstractNumId="1" w15:restartNumberingAfterBreak="0">
+    <w:nsid w:val="40A7179A"/>
+    <w:multiLevelType w:val="multilevel"/>
+    <w:tmpl w:val="416E7272"/>
+    <w:lvl w:ilvl="0">
+      <w:start w:val="1"/>
+      <w:numFmt w:val="bullet"/>
+      <w:lvlText w:val=""/>
+      <w:lvlJc w:val="left"/>
+      <w:pPr>
+        <w:tabs>
+          <w:tab w:val="num" w:pos="720"/>
+        </w:tabs>
+        <w:ind w:left="720" w:hanging="360"/>
+      </w:pPr>
+      <w:rPr>
+        <w:rFonts w:ascii="Symbol" w:hAnsi="Symbol" w:hint="default"/>
+        <w:sz w:val="20"/>
+      </w:rPr>
+    </w:lvl>
+    <w:lvl w:ilvl="1">
+      <w:start w:val="1"/>
+      <w:numFmt w:val="bullet"/>
+      <w:lvlText w:val="o"/>
+      <w:lvlJc w:val="left"/>
+      <w:pPr>
+        <w:tabs>
+          <w:tab w:val="num" w:pos="1440"/>
+        </w:tabs>
+        <w:ind w:left="1440" w:hanging="360"/>
+      </w:pPr>
+      <w:rPr>
+        <w:rFonts w:ascii="Courier New" w:hAnsi="Courier New" w:hint="default"/>
+        <w:sz w:val="20"/>
+      </w:rPr>
+    </w:lvl>
+    <w:lvl w:ilvl="2" w:tentative="1">
+      <w:start w:val="1"/>
+      <w:numFmt w:val="bullet"/>
+      <w:lvlText w:val=""/>
+      <w:lvlJc w:val="left"/>
+      <w:pPr>
+        <w:tabs>
+          <w:tab w:val="num" w:pos="2160"/>
+        </w:tabs>
+        <w:ind w:left="2160" w:hanging="360"/>
+      </w:pPr>
+      <w:rPr>
+        <w:rFonts w:ascii="Wingdings" w:hAnsi="Wingdings" w:hint="default"/>
+        <w:sz w:val="20"/>
+      </w:rPr>
+    </w:lvl>
+    <w:lvl w:ilvl="3" w:tentative="1">
+      <w:start w:val="1"/>
+      <w:numFmt w:val="bullet"/>
+      <w:lvlText w:val=""/>
+      <w:lvlJc w:val="left"/>
+      <w:pPr>
+        <w:tabs>
+          <w:tab w:val="num" w:pos="2880"/>
+        </w:tabs>
+        <w:ind w:left="2880" w:hanging="360"/>
+      </w:pPr>
+      <w:rPr>
+        <w:rFonts w:ascii="Wingdings" w:hAnsi="Wingdings" w:hint="default"/>
+        <w:sz w:val="20"/>
+      </w:rPr>
+    </w:lvl>
+    <w:lvl w:ilvl="4" w:tentative="1">
+      <w:start w:val="1"/>
+      <w:numFmt w:val="bullet"/>
+      <w:lvlText w:val=""/>
+      <w:lvlJc w:val="left"/>
+      <w:pPr>
+        <w:tabs>
+          <w:tab w:val="num" w:pos="3600"/>
+        </w:tabs>
+        <w:ind w:left="3600" w:hanging="360"/>
+      </w:pPr>
+      <w:rPr>
+        <w:rFonts w:ascii="Wingdings" w:hAnsi="Wingdings" w:hint="default"/>
+        <w:sz w:val="20"/>
+      </w:rPr>
+    </w:lvl>
+    <w:lvl w:ilvl="5" w:tentative="1">
+      <w:start w:val="1"/>
+      <w:numFmt w:val="bullet"/>
+      <w:lvlText w:val=""/>
+      <w:lvlJc w:val="left"/>
+      <w:pPr>
+        <w:tabs>
+          <w:tab w:val="num" w:pos="4320"/>
+        </w:tabs>
+        <w:ind w:left="4320" w:hanging="360"/>
+      </w:pPr>
+      <w:rPr>
+        <w:rFonts w:ascii="Wingdings" w:hAnsi="Wingdings" w:hint="default"/>
+        <w:sz w:val="20"/>
+      </w:rPr>
+    </w:lvl>
+    <w:lvl w:ilvl="6" w:tentative="1">
+      <w:start w:val="1"/>
+      <w:numFmt w:val="bullet"/>
+      <w:lvlText w:val=""/>
+      <w:lvlJc w:val="left"/>
+      <w:pPr>
+        <w:tabs>
+          <w:tab w:val="num" w:pos="5040"/>
+        </w:tabs>
+        <w:ind w:left="5040" w:hanging="360"/>
+      </w:pPr>
+      <w:rPr>
+        <w:rFonts w:ascii="Wingdings" w:hAnsi="Wingdings" w:hint="default"/>
+        <w:sz w:val="20"/>
+      </w:rPr>
+    </w:lvl>
+    <w:lvl w:ilvl="7" w:tentative="1">
+      <w:start w:val="1"/>
+      <w:numFmt w:val="bullet"/>
+      <w:lvlText w:val=""/>
+      <w:lvlJc w:val="left"/>
+      <w:pPr>
+        <w:tabs>
+          <w:tab w:val="num" w:pos="5760"/>
+        </w:tabs>
+        <w:ind w:left="5760" w:hanging="360"/>
+      </w:pPr>
+      <w:rPr>
+        <w:rFonts w:ascii="Wingdings" w:hAnsi="Wingdings" w:hint="default"/>
+        <w:sz w:val="20"/>
+      </w:rPr>
+    </w:lvl>
+    <w:lvl w:ilvl="8" w:tentative="1">
+      <w:start w:val="1"/>
+      <w:numFmt w:val="bullet"/>
+      <w:lvlText w:val=""/>
+      <w:lvlJc w:val="left"/>
+      <w:pPr>
+        <w:tabs>
+          <w:tab w:val="num" w:pos="6480"/>
+        </w:tabs>
+        <w:ind w:left="6480" w:hanging="360"/>
+      </w:pPr>
+      <w:rPr>
+        <w:rFonts w:ascii="Wingdings" w:hAnsi="Wingdings" w:hint="default"/>
+        <w:sz w:val="20"/>
+      </w:rPr>
+    </w:lvl>
+  </w:abstractNum>
+  <w:abstractNum w:abstractNumId="2" w15:restartNumberingAfterBreak="0">
     <w:nsid w:val="43B00AA3"/>
     <w:multiLevelType w:val="hybridMultilevel"/>
     <w:tmpl w:val="468CFF2C"/>
@@ -1020,7 +2123,7 @@
       </w:rPr>
     </w:lvl>
   </w:abstractNum>
-  <w:abstractNum w:abstractNumId="1" w15:restartNumberingAfterBreak="0">
+  <w:abstractNum w:abstractNumId="3" w15:restartNumberingAfterBreak="0">
     <w:nsid w:val="6E1F725C"/>
     <w:multiLevelType w:val="hybridMultilevel"/>
     <w:tmpl w:val="BBCAA328"/>
@@ -1110,10 +2213,16 @@
     </w:lvl>
   </w:abstractNum>
   <w:num w:numId="1" w16cid:durableId="157814955">
-    <w:abstractNumId w:val="0"/>
+    <w:abstractNumId w:val="2"/>
   </w:num>
   <w:num w:numId="2" w16cid:durableId="1337341887">
+    <w:abstractNumId w:val="3"/>
+  </w:num>
+  <w:num w:numId="3" w16cid:durableId="213810374">
     <w:abstractNumId w:val="1"/>
+  </w:num>
+  <w:num w:numId="4" w16cid:durableId="2124424165">
+    <w:abstractNumId w:val="0"/>
   </w:num>
 </w:numbering>
 </file>
@@ -1569,7 +2678,6 @@
     <w:next w:val="Normal"/>
     <w:link w:val="Heading3Char"/>
     <w:uiPriority w:val="9"/>
-    <w:semiHidden/>
     <w:unhideWhenUsed/>
     <w:qFormat/>
     <w:rsid w:val="002A46FE"/>
@@ -1777,7 +2885,6 @@
     <w:basedOn w:val="DefaultParagraphFont"/>
     <w:link w:val="Heading3"/>
     <w:uiPriority w:val="9"/>
-    <w:semiHidden/>
     <w:rsid w:val="002A46FE"/>
     <w:rPr>
       <w:rFonts w:eastAsiaTheme="majorEastAsia" w:cstheme="majorBidi"/>
@@ -2033,6 +3140,22 @@
       <w:smallCaps/>
       <w:color w:val="0F4761" w:themeColor="accent1" w:themeShade="BF"/>
       <w:spacing w:val="5"/>
+    </w:rPr>
+  </w:style>
+  <w:style w:type="paragraph" w:styleId="NormalWeb">
+    <w:name w:val="Normal (Web)"/>
+    <w:basedOn w:val="Normal"/>
+    <w:uiPriority w:val="99"/>
+    <w:semiHidden/>
+    <w:unhideWhenUsed/>
+    <w:rsid w:val="00F63A64"/>
+    <w:pPr>
+      <w:spacing w:before="100" w:beforeAutospacing="1" w:after="100" w:afterAutospacing="1" w:line="240" w:lineRule="auto"/>
+    </w:pPr>
+    <w:rPr>
+      <w:rFonts w:ascii="Times New Roman" w:eastAsia="Times New Roman" w:hAnsi="Times New Roman" w:cs="Times New Roman"/>
+      <w:kern w:val="0"/>
+      <w14:ligatures w14:val="none"/>
     </w:rPr>
   </w:style>
 </w:styles>

</xml_diff>